<commit_message>
fix: correct the end-of-service attestation signatory formula
Co-authored-by: Cursor <cursoragent@cursor.com>
</commit_message>
<xml_diff>
--- a/Excel/templates/exit/Attestation de fin de service.docx
+++ b/Excel/templates/exit/Attestation de fin de service.docx
@@ -152,7 +152,7 @@
           <w:szCs w:val="26"/>
           <w:lang w:val="fr-FR" w:eastAsia="en-ZA"/>
         </w:rPr>
-        <w:t xml:space="preserve">Nous, soussignée, </w:t>
+        <w:t xml:space="preserve">Je soussignée, </w:t>
       </w:r>
       <w:r>
         <w:rPr>
@@ -163,7 +163,7 @@
           <w:szCs w:val="26"/>
           <w:lang w:val="fr-FR" w:eastAsia="en-ZA"/>
         </w:rPr>
-        <w:t>Carine EWULI</w:t>
+        <w:t>Madame Carine EWULI SUKA</w:t>
       </w:r>
       <w:r>
         <w:rPr>
@@ -173,7 +173,7 @@
           <w:szCs w:val="26"/>
           <w:lang w:val="fr-FR" w:eastAsia="en-ZA"/>
         </w:rPr>
-        <w:t xml:space="preserve">, Directrice des Ressources Humaines de PPC Barnet DRC </w:t>
+        <w:t xml:space="preserve">, Directrice des ressources humaines de PPC Barnet DRC </w:t>
       </w:r>
       <w:proofErr w:type="spellStart"/>
       <w:r>
@@ -195,7 +195,7 @@
           <w:szCs w:val="26"/>
           <w:lang w:val="fr-FR" w:eastAsia="en-ZA"/>
         </w:rPr>
-        <w:t xml:space="preserve"> SA, atteste par le présent que Monsieur </w:t>
+        <w:t xml:space="preserve"> SA, atteste que Monsieur </w:t>
       </w:r>
       <w:r>
         <w:rPr>
@@ -519,7 +519,7 @@
           <w:szCs w:val="26"/>
           <w:lang w:val="fr-FR" w:eastAsia="en-ZA"/>
         </w:rPr>
-        <w:t xml:space="preserve"> Le présent lui est délivré pour le faire valoir ce que de droit.</w:t>
+        <w:t xml:space="preserve"> Le présent lui est délivré pour faire valoir ce que de droit.</w:t>
       </w:r>
     </w:p>
     <w:p>
@@ -645,7 +645,7 @@
           <w:u w:val="single"/>
           <w:lang w:val="fr-FR" w:eastAsia="en-ZA"/>
         </w:rPr>
-        <w:t>Carine EWULI</w:t>
+        <w:t>Carine EWULI SUKA</w:t>
       </w:r>
     </w:p>
     <w:p>

</xml_diff>